<commit_message>
Restore program links and video thumbnails
</commit_message>
<xml_diff>
--- a/resources/program/Farm-in-a-Box-25-Period-Teaching-Program-v1.0.docx
+++ b/resources/program/Farm-in-a-Box-25-Period-Teaching-Program-v1.0.docx
@@ -2075,6 +2075,7 @@
           <w:tblHeader w:val="true"/>
           <w:tblHeader w:val="true"/>
           <w:tblHeader w:val="true"/>
+          <w:tblHeader w:val="true"/>
         </w:trPr>
         <w:tc>
           <w:tcPr>
@@ -2250,6 +2251,7 @@
           <w:cantSplit/>
           <w:cantSplit/>
           <w:cantSplit/>
+          <w:cantSplit/>
         </w:trPr>
         <w:tc>
           <w:tcPr>
@@ -2324,15 +2326,17 @@
               <w:spacing w:after="0" w:before="0" w:line="240" w:lineRule="auto"/>
               <w:jc w:val="left"/>
             </w:pPr>
-            <w:r>
-              <w:rPr>
-                <w:rFonts w:ascii="Aptos" w:hAnsi="Aptos"/>
-                <w:b w:val="0"/>
-                <w:color w:val="243024"/>
-                <w:sz w:val="19"/>
-              </w:rPr>
-              <w:t>Agriculture as a connected system</w:t>
-            </w:r>
+            <w:hyperlink r:id="rId40">
+              <w:r>
+                <w:rPr>
+                  <w:color w:val="2B6B3F"/>
+                  <w:u w:val="single"/>
+                  <w:rFonts w:ascii="Aptos" w:hAnsi="Aptos"/>
+                  <w:sz w:val="19"/>
+                </w:rPr>
+                <w:t>Agriculture as a connected system</w:t>
+              </w:r>
+            </w:hyperlink>
           </w:p>
         </w:tc>
         <w:tc>
@@ -2427,6 +2431,7 @@
           <w:cantSplit/>
           <w:cantSplit/>
           <w:cantSplit/>
+          <w:cantSplit/>
         </w:trPr>
         <w:tc>
           <w:tcPr>
@@ -2501,15 +2506,17 @@
               <w:spacing w:after="0" w:before="0" w:line="240" w:lineRule="auto"/>
               <w:jc w:val="left"/>
             </w:pPr>
-            <w:r>
-              <w:rPr>
-                <w:rFonts w:ascii="Aptos" w:hAnsi="Aptos"/>
-                <w:b w:val="0"/>
-                <w:color w:val="243024"/>
-                <w:sz w:val="19"/>
-              </w:rPr>
-              <w:t>Launch: grow more with less</w:t>
-            </w:r>
+            <w:hyperlink r:id="rId40">
+              <w:r>
+                <w:rPr>
+                  <w:color w:val="2B6B3F"/>
+                  <w:u w:val="single"/>
+                  <w:rFonts w:ascii="Aptos" w:hAnsi="Aptos"/>
+                  <w:sz w:val="19"/>
+                </w:rPr>
+                <w:t>Launch: grow more with less</w:t>
+              </w:r>
+            </w:hyperlink>
           </w:p>
         </w:tc>
         <w:tc>
@@ -2604,6 +2611,7 @@
           <w:cantSplit/>
           <w:cantSplit/>
           <w:cantSplit/>
+          <w:cantSplit/>
         </w:trPr>
         <w:tc>
           <w:tcPr>
@@ -2678,15 +2686,17 @@
               <w:spacing w:after="0" w:before="0" w:line="240" w:lineRule="auto"/>
               <w:jc w:val="left"/>
             </w:pPr>
-            <w:r>
-              <w:rPr>
-                <w:rFonts w:ascii="Aptos" w:hAnsi="Aptos"/>
-                <w:b w:val="0"/>
-                <w:color w:val="243024"/>
-                <w:sz w:val="19"/>
-              </w:rPr>
-              <w:t>First foods: plants, animals and nutrition</w:t>
-            </w:r>
+            <w:hyperlink r:id="rId41">
+              <w:r>
+                <w:rPr>
+                  <w:color w:val="2B6B3F"/>
+                  <w:u w:val="single"/>
+                  <w:rFonts w:ascii="Aptos" w:hAnsi="Aptos"/>
+                  <w:sz w:val="19"/>
+                </w:rPr>
+                <w:t>First foods: plants, animals and nutrition</w:t>
+              </w:r>
+            </w:hyperlink>
           </w:p>
         </w:tc>
         <w:tc>
@@ -2781,6 +2791,7 @@
           <w:cantSplit/>
           <w:cantSplit/>
           <w:cantSplit/>
+          <w:cantSplit/>
         </w:trPr>
         <w:tc>
           <w:tcPr>
@@ -2855,15 +2866,17 @@
               <w:spacing w:after="0" w:before="0" w:line="240" w:lineRule="auto"/>
               <w:jc w:val="left"/>
             </w:pPr>
-            <w:r>
-              <w:rPr>
-                <w:rFonts w:ascii="Aptos" w:hAnsi="Aptos"/>
-                <w:b w:val="0"/>
-                <w:color w:val="243024"/>
-                <w:sz w:val="19"/>
-              </w:rPr>
-              <w:t>Country and future farms</w:t>
-            </w:r>
+            <w:hyperlink r:id="rId41">
+              <w:r>
+                <w:rPr>
+                  <w:color w:val="2B6B3F"/>
+                  <w:u w:val="single"/>
+                  <w:rFonts w:ascii="Aptos" w:hAnsi="Aptos"/>
+                  <w:sz w:val="19"/>
+                </w:rPr>
+                <w:t>Country and future farms</w:t>
+              </w:r>
+            </w:hyperlink>
           </w:p>
         </w:tc>
         <w:tc>
@@ -2958,6 +2971,7 @@
           <w:cantSplit/>
           <w:cantSplit/>
           <w:cantSplit/>
+          <w:cantSplit/>
         </w:trPr>
         <w:tc>
           <w:tcPr>
@@ -3032,15 +3046,17 @@
               <w:spacing w:after="0" w:before="0" w:line="240" w:lineRule="auto"/>
               <w:jc w:val="left"/>
             </w:pPr>
-            <w:r>
-              <w:rPr>
-                <w:rFonts w:ascii="Aptos" w:hAnsi="Aptos"/>
-                <w:b w:val="0"/>
-                <w:color w:val="243024"/>
-                <w:sz w:val="19"/>
-              </w:rPr>
-              <w:t>Sustainability lens</w:t>
-            </w:r>
+            <w:hyperlink r:id="rId41">
+              <w:r>
+                <w:rPr>
+                  <w:color w:val="2B6B3F"/>
+                  <w:u w:val="single"/>
+                  <w:rFonts w:ascii="Aptos" w:hAnsi="Aptos"/>
+                  <w:sz w:val="19"/>
+                </w:rPr>
+                <w:t>Sustainability lens</w:t>
+              </w:r>
+            </w:hyperlink>
           </w:p>
         </w:tc>
         <w:tc>
@@ -3135,6 +3151,7 @@
           <w:cantSplit/>
           <w:cantSplit/>
           <w:cantSplit/>
+          <w:cantSplit/>
         </w:trPr>
         <w:tc>
           <w:tcPr>
@@ -3209,15 +3226,17 @@
               <w:spacing w:after="0" w:before="0" w:line="240" w:lineRule="auto"/>
               <w:jc w:val="left"/>
             </w:pPr>
-            <w:r>
-              <w:rPr>
-                <w:rFonts w:ascii="Aptos" w:hAnsi="Aptos"/>
-                <w:b w:val="0"/>
-                <w:color w:val="243024"/>
-                <w:sz w:val="19"/>
-              </w:rPr>
-              <w:t>Plant parts and functions</w:t>
-            </w:r>
+            <w:hyperlink r:id="rId42">
+              <w:r>
+                <w:rPr>
+                  <w:color w:val="2B6B3F"/>
+                  <w:u w:val="single"/>
+                  <w:rFonts w:ascii="Aptos" w:hAnsi="Aptos"/>
+                  <w:sz w:val="19"/>
+                </w:rPr>
+                <w:t>Plant parts and functions</w:t>
+              </w:r>
+            </w:hyperlink>
           </w:p>
         </w:tc>
         <w:tc>
@@ -3312,6 +3331,7 @@
           <w:cantSplit/>
           <w:cantSplit/>
           <w:cantSplit/>
+          <w:cantSplit/>
         </w:trPr>
         <w:tc>
           <w:tcPr>
@@ -3386,15 +3406,17 @@
               <w:spacing w:after="0" w:before="0" w:line="240" w:lineRule="auto"/>
               <w:jc w:val="left"/>
             </w:pPr>
-            <w:r>
-              <w:rPr>
-                <w:rFonts w:ascii="Aptos" w:hAnsi="Aptos"/>
-                <w:b w:val="0"/>
-                <w:color w:val="243024"/>
-                <w:sz w:val="19"/>
-              </w:rPr>
-              <w:t>Crop and germination research</w:t>
-            </w:r>
+            <w:hyperlink r:id="rId42">
+              <w:r>
+                <w:rPr>
+                  <w:color w:val="2B6B3F"/>
+                  <w:u w:val="single"/>
+                  <w:rFonts w:ascii="Aptos" w:hAnsi="Aptos"/>
+                  <w:sz w:val="19"/>
+                </w:rPr>
+                <w:t>Crop and germination research</w:t>
+              </w:r>
+            </w:hyperlink>
           </w:p>
         </w:tc>
         <w:tc>
@@ -3489,6 +3511,7 @@
           <w:cantSplit/>
           <w:cantSplit/>
           <w:cantSplit/>
+          <w:cantSplit/>
         </w:trPr>
         <w:tc>
           <w:tcPr>
@@ -3563,15 +3586,17 @@
               <w:spacing w:after="0" w:before="0" w:line="240" w:lineRule="auto"/>
               <w:jc w:val="left"/>
             </w:pPr>
-            <w:r>
-              <w:rPr>
-                <w:rFonts w:ascii="Aptos" w:hAnsi="Aptos"/>
-                <w:b w:val="0"/>
-                <w:color w:val="243024"/>
-                <w:sz w:val="19"/>
-              </w:rPr>
-              <w:t>Sow the approved crop</w:t>
-            </w:r>
+            <w:hyperlink r:id="rId42">
+              <w:r>
+                <w:rPr>
+                  <w:color w:val="2B6B3F"/>
+                  <w:u w:val="single"/>
+                  <w:rFonts w:ascii="Aptos" w:hAnsi="Aptos"/>
+                  <w:sz w:val="19"/>
+                </w:rPr>
+                <w:t>Sow the approved crop</w:t>
+              </w:r>
+            </w:hyperlink>
           </w:p>
         </w:tc>
         <w:tc>
@@ -3666,6 +3691,7 @@
           <w:cantSplit/>
           <w:cantSplit/>
           <w:cantSplit/>
+          <w:cantSplit/>
         </w:trPr>
         <w:tc>
           <w:tcPr>
@@ -3740,15 +3766,17 @@
               <w:spacing w:after="0" w:before="0" w:line="240" w:lineRule="auto"/>
               <w:jc w:val="left"/>
             </w:pPr>
-            <w:r>
-              <w:rPr>
-                <w:rFonts w:ascii="Aptos" w:hAnsi="Aptos"/>
-                <w:b w:val="0"/>
-                <w:color w:val="243024"/>
-                <w:sz w:val="19"/>
-              </w:rPr>
-              <w:t>Growing media and circular nutrients</w:t>
-            </w:r>
+            <w:hyperlink r:id="rId43">
+              <w:r>
+                <w:rPr>
+                  <w:color w:val="2B6B3F"/>
+                  <w:u w:val="single"/>
+                  <w:rFonts w:ascii="Aptos" w:hAnsi="Aptos"/>
+                  <w:sz w:val="19"/>
+                </w:rPr>
+                <w:t>Growing media and circular nutrients</w:t>
+              </w:r>
+            </w:hyperlink>
           </w:p>
         </w:tc>
         <w:tc>
@@ -3843,6 +3871,7 @@
           <w:cantSplit/>
           <w:cantSplit/>
           <w:cantSplit/>
+          <w:cantSplit/>
         </w:trPr>
         <w:tc>
           <w:tcPr>
@@ -3917,15 +3946,17 @@
               <w:spacing w:after="0" w:before="0" w:line="240" w:lineRule="auto"/>
               <w:jc w:val="left"/>
             </w:pPr>
-            <w:r>
-              <w:rPr>
-                <w:rFonts w:ascii="Aptos" w:hAnsi="Aptos"/>
-                <w:b w:val="0"/>
-                <w:color w:val="243024"/>
-                <w:sz w:val="19"/>
-              </w:rPr>
-              <w:t>Fair media test</w:t>
-            </w:r>
+            <w:hyperlink r:id="rId43">
+              <w:r>
+                <w:rPr>
+                  <w:color w:val="2B6B3F"/>
+                  <w:u w:val="single"/>
+                  <w:rFonts w:ascii="Aptos" w:hAnsi="Aptos"/>
+                  <w:sz w:val="19"/>
+                </w:rPr>
+                <w:t>Fair media test</w:t>
+              </w:r>
+            </w:hyperlink>
           </w:p>
         </w:tc>
         <w:tc>
@@ -4106,6 +4137,7 @@
           <w:tblHeader w:val="true"/>
           <w:tblHeader w:val="true"/>
           <w:tblHeader w:val="true"/>
+          <w:tblHeader w:val="true"/>
         </w:trPr>
         <w:tc>
           <w:tcPr>
@@ -4281,6 +4313,7 @@
           <w:cantSplit/>
           <w:cantSplit/>
           <w:cantSplit/>
+          <w:cantSplit/>
         </w:trPr>
         <w:tc>
           <w:tcPr>
@@ -4355,15 +4388,17 @@
               <w:spacing w:after="0" w:before="0" w:line="240" w:lineRule="auto"/>
               <w:jc w:val="left"/>
             </w:pPr>
-            <w:r>
-              <w:rPr>
-                <w:rFonts w:ascii="Aptos" w:hAnsi="Aptos"/>
-                <w:b w:val="0"/>
-                <w:color w:val="243024"/>
-                <w:sz w:val="19"/>
-              </w:rPr>
-              <w:t>Water pathways and smart systems</w:t>
-            </w:r>
+            <w:hyperlink r:id="rId44">
+              <w:r>
+                <w:rPr>
+                  <w:color w:val="2B6B3F"/>
+                  <w:u w:val="single"/>
+                  <w:rFonts w:ascii="Aptos" w:hAnsi="Aptos"/>
+                  <w:sz w:val="19"/>
+                </w:rPr>
+                <w:t>Water pathways and smart systems</w:t>
+              </w:r>
+            </w:hyperlink>
           </w:p>
         </w:tc>
         <w:tc>
@@ -4458,6 +4493,7 @@
           <w:cantSplit/>
           <w:cantSplit/>
           <w:cantSplit/>
+          <w:cantSplit/>
         </w:trPr>
         <w:tc>
           <w:tcPr>
@@ -4532,15 +4568,17 @@
               <w:spacing w:after="0" w:before="0" w:line="240" w:lineRule="auto"/>
               <w:jc w:val="left"/>
             </w:pPr>
-            <w:r>
-              <w:rPr>
-                <w:rFonts w:ascii="Aptos" w:hAnsi="Aptos"/>
-                <w:b w:val="0"/>
-                <w:color w:val="243024"/>
-                <w:sz w:val="19"/>
-              </w:rPr>
-              <w:t>Build and test a wick</w:t>
-            </w:r>
+            <w:hyperlink r:id="rId44">
+              <w:r>
+                <w:rPr>
+                  <w:color w:val="2B6B3F"/>
+                  <w:u w:val="single"/>
+                  <w:rFonts w:ascii="Aptos" w:hAnsi="Aptos"/>
+                  <w:sz w:val="19"/>
+                </w:rPr>
+                <w:t>Build and test a wick</w:t>
+              </w:r>
+            </w:hyperlink>
           </w:p>
         </w:tc>
         <w:tc>
@@ -4635,6 +4673,7 @@
           <w:cantSplit/>
           <w:cantSplit/>
           <w:cantSplit/>
+          <w:cantSplit/>
         </w:trPr>
         <w:tc>
           <w:tcPr>
@@ -4709,15 +4748,17 @@
               <w:spacing w:after="0" w:before="0" w:line="240" w:lineRule="auto"/>
               <w:jc w:val="left"/>
             </w:pPr>
-            <w:r>
-              <w:rPr>
-                <w:rFonts w:ascii="Aptos" w:hAnsi="Aptos"/>
-                <w:b w:val="0"/>
-                <w:color w:val="243024"/>
-                <w:sz w:val="19"/>
-              </w:rPr>
-              <w:t>Read the microclimate</w:t>
-            </w:r>
+            <w:hyperlink r:id="rId45">
+              <w:r>
+                <w:rPr>
+                  <w:color w:val="2B6B3F"/>
+                  <w:u w:val="single"/>
+                  <w:rFonts w:ascii="Aptos" w:hAnsi="Aptos"/>
+                  <w:sz w:val="19"/>
+                </w:rPr>
+                <w:t>Read the microclimate</w:t>
+              </w:r>
+            </w:hyperlink>
           </w:p>
         </w:tc>
         <w:tc>
@@ -4812,6 +4853,7 @@
           <w:cantSplit/>
           <w:cantSplit/>
           <w:cantSplit/>
+          <w:cantSplit/>
         </w:trPr>
         <w:tc>
           <w:tcPr>
@@ -4886,15 +4928,17 @@
               <w:spacing w:after="0" w:before="0" w:line="240" w:lineRule="auto"/>
               <w:jc w:val="left"/>
             </w:pPr>
-            <w:r>
-              <w:rPr>
-                <w:rFonts w:ascii="Aptos" w:hAnsi="Aptos"/>
-                <w:b w:val="0"/>
-                <w:color w:val="243024"/>
-                <w:sz w:val="19"/>
-              </w:rPr>
-              <w:t>Crop stress and biosecurity</w:t>
-            </w:r>
+            <w:hyperlink r:id="rId45">
+              <w:r>
+                <w:rPr>
+                  <w:color w:val="2B6B3F"/>
+                  <w:u w:val="single"/>
+                  <w:rFonts w:ascii="Aptos" w:hAnsi="Aptos"/>
+                  <w:sz w:val="19"/>
+                </w:rPr>
+                <w:t>Crop stress and biosecurity</w:t>
+              </w:r>
+            </w:hyperlink>
           </w:p>
         </w:tc>
         <w:tc>
@@ -4989,6 +5033,7 @@
           <w:cantSplit/>
           <w:cantSplit/>
           <w:cantSplit/>
+          <w:cantSplit/>
         </w:trPr>
         <w:tc>
           <w:tcPr>
@@ -5063,15 +5108,17 @@
               <w:spacing w:after="0" w:before="0" w:line="240" w:lineRule="auto"/>
               <w:jc w:val="left"/>
             </w:pPr>
-            <w:r>
-              <w:rPr>
-                <w:rFonts w:ascii="Aptos" w:hAnsi="Aptos"/>
-                <w:b w:val="0"/>
-                <w:color w:val="243024"/>
-                <w:sz w:val="19"/>
-              </w:rPr>
-              <w:t>Brief, criteria and constraints</w:t>
-            </w:r>
+            <w:hyperlink r:id="rId46">
+              <w:r>
+                <w:rPr>
+                  <w:color w:val="2B6B3F"/>
+                  <w:u w:val="single"/>
+                  <w:rFonts w:ascii="Aptos" w:hAnsi="Aptos"/>
+                  <w:sz w:val="19"/>
+                </w:rPr>
+                <w:t>Brief, criteria and constraints</w:t>
+              </w:r>
+            </w:hyperlink>
           </w:p>
         </w:tc>
         <w:tc>
@@ -5166,6 +5213,7 @@
           <w:cantSplit/>
           <w:cantSplit/>
           <w:cantSplit/>
+          <w:cantSplit/>
         </w:trPr>
         <w:tc>
           <w:tcPr>
@@ -5240,15 +5288,17 @@
               <w:spacing w:after="0" w:before="0" w:line="240" w:lineRule="auto"/>
               <w:jc w:val="left"/>
             </w:pPr>
-            <w:r>
-              <w:rPr>
-                <w:rFonts w:ascii="Aptos" w:hAnsi="Aptos"/>
-                <w:b w:val="0"/>
-                <w:color w:val="243024"/>
-                <w:sz w:val="19"/>
-              </w:rPr>
-              <w:t>Concepts and decision matrix</w:t>
-            </w:r>
+            <w:hyperlink r:id="rId46">
+              <w:r>
+                <w:rPr>
+                  <w:color w:val="2B6B3F"/>
+                  <w:u w:val="single"/>
+                  <w:rFonts w:ascii="Aptos" w:hAnsi="Aptos"/>
+                  <w:sz w:val="19"/>
+                </w:rPr>
+                <w:t>Concepts and decision matrix</w:t>
+              </w:r>
+            </w:hyperlink>
           </w:p>
         </w:tc>
         <w:tc>
@@ -5343,6 +5393,7 @@
           <w:cantSplit/>
           <w:cantSplit/>
           <w:cantSplit/>
+          <w:cantSplit/>
         </w:trPr>
         <w:tc>
           <w:tcPr>
@@ -5417,15 +5468,17 @@
               <w:spacing w:after="0" w:before="0" w:line="240" w:lineRule="auto"/>
               <w:jc w:val="left"/>
             </w:pPr>
-            <w:r>
-              <w:rPr>
-                <w:rFonts w:ascii="Aptos" w:hAnsi="Aptos"/>
-                <w:b w:val="0"/>
-                <w:color w:val="243024"/>
-                <w:sz w:val="19"/>
-              </w:rPr>
-              <w:t>Production and risk plan</w:t>
-            </w:r>
+            <w:hyperlink r:id="rId46">
+              <w:r>
+                <w:rPr>
+                  <w:color w:val="2B6B3F"/>
+                  <w:u w:val="single"/>
+                  <w:rFonts w:ascii="Aptos" w:hAnsi="Aptos"/>
+                  <w:sz w:val="19"/>
+                </w:rPr>
+                <w:t>Production and risk plan</w:t>
+              </w:r>
+            </w:hyperlink>
           </w:p>
         </w:tc>
         <w:tc>
@@ -5520,6 +5573,7 @@
           <w:cantSplit/>
           <w:cantSplit/>
           <w:cantSplit/>
+          <w:cantSplit/>
         </w:trPr>
         <w:tc>
           <w:tcPr>
@@ -5594,15 +5648,17 @@
               <w:spacing w:after="0" w:before="0" w:line="240" w:lineRule="auto"/>
               <w:jc w:val="left"/>
             </w:pPr>
-            <w:r>
-              <w:rPr>
-                <w:rFonts w:ascii="Aptos" w:hAnsi="Aptos"/>
-                <w:b w:val="0"/>
-                <w:color w:val="243024"/>
-                <w:sz w:val="19"/>
-              </w:rPr>
-              <w:t>Workspace readiness</w:t>
-            </w:r>
+            <w:hyperlink r:id="rId47">
+              <w:r>
+                <w:rPr>
+                  <w:color w:val="2B6B3F"/>
+                  <w:u w:val="single"/>
+                  <w:rFonts w:ascii="Aptos" w:hAnsi="Aptos"/>
+                  <w:sz w:val="19"/>
+                </w:rPr>
+                <w:t>Workspace readiness</w:t>
+              </w:r>
+            </w:hyperlink>
           </w:p>
         </w:tc>
         <w:tc>
@@ -5697,6 +5753,7 @@
           <w:cantSplit/>
           <w:cantSplit/>
           <w:cantSplit/>
+          <w:cantSplit/>
         </w:trPr>
         <w:tc>
           <w:tcPr>
@@ -5771,15 +5828,17 @@
               <w:spacing w:after="0" w:before="0" w:line="240" w:lineRule="auto"/>
               <w:jc w:val="left"/>
             </w:pPr>
-            <w:r>
-              <w:rPr>
-                <w:rFonts w:ascii="Aptos" w:hAnsi="Aptos"/>
-                <w:b w:val="0"/>
-                <w:color w:val="243024"/>
-                <w:sz w:val="19"/>
-              </w:rPr>
-              <w:t>Build and progressively test</w:t>
-            </w:r>
+            <w:hyperlink r:id="rId47">
+              <w:r>
+                <w:rPr>
+                  <w:color w:val="2B6B3F"/>
+                  <w:u w:val="single"/>
+                  <w:rFonts w:ascii="Aptos" w:hAnsi="Aptos"/>
+                  <w:sz w:val="19"/>
+                </w:rPr>
+                <w:t>Build and progressively test</w:t>
+              </w:r>
+            </w:hyperlink>
           </w:p>
         </w:tc>
         <w:tc>
@@ -5874,6 +5933,7 @@
           <w:cantSplit/>
           <w:cantSplit/>
           <w:cantSplit/>
+          <w:cantSplit/>
         </w:trPr>
         <w:tc>
           <w:tcPr>
@@ -5948,15 +6008,17 @@
               <w:spacing w:after="0" w:before="0" w:line="240" w:lineRule="auto"/>
               <w:jc w:val="left"/>
             </w:pPr>
-            <w:r>
-              <w:rPr>
-                <w:rFonts w:ascii="Aptos" w:hAnsi="Aptos"/>
-                <w:b w:val="0"/>
-                <w:color w:val="243024"/>
-                <w:sz w:val="19"/>
-              </w:rPr>
-              <w:t>Establish the crop</w:t>
-            </w:r>
+            <w:hyperlink r:id="rId47">
+              <w:r>
+                <w:rPr>
+                  <w:color w:val="2B6B3F"/>
+                  <w:u w:val="single"/>
+                  <w:rFonts w:ascii="Aptos" w:hAnsi="Aptos"/>
+                  <w:sz w:val="19"/>
+                </w:rPr>
+                <w:t>Establish the crop</w:t>
+              </w:r>
+            </w:hyperlink>
           </w:p>
         </w:tc>
         <w:tc>
@@ -6137,6 +6199,7 @@
           <w:tblHeader w:val="true"/>
           <w:tblHeader w:val="true"/>
           <w:tblHeader w:val="true"/>
+          <w:tblHeader w:val="true"/>
         </w:trPr>
         <w:tc>
           <w:tcPr>
@@ -6312,6 +6375,7 @@
           <w:cantSplit/>
           <w:cantSplit/>
           <w:cantSplit/>
+          <w:cantSplit/>
         </w:trPr>
         <w:tc>
           <w:tcPr>
@@ -6386,15 +6450,17 @@
               <w:spacing w:after="0" w:before="0" w:line="240" w:lineRule="auto"/>
               <w:jc w:val="left"/>
             </w:pPr>
-            <w:r>
-              <w:rPr>
-                <w:rFonts w:ascii="Aptos" w:hAnsi="Aptos"/>
-                <w:b w:val="0"/>
-                <w:color w:val="243024"/>
-                <w:sz w:val="19"/>
-              </w:rPr>
-              <w:t>Useful field data</w:t>
-            </w:r>
+            <w:hyperlink r:id="rId48">
+              <w:r>
+                <w:rPr>
+                  <w:color w:val="2B6B3F"/>
+                  <w:u w:val="single"/>
+                  <w:rFonts w:ascii="Aptos" w:hAnsi="Aptos"/>
+                  <w:sz w:val="19"/>
+                </w:rPr>
+                <w:t>Useful field data</w:t>
+              </w:r>
+            </w:hyperlink>
           </w:p>
         </w:tc>
         <w:tc>
@@ -6489,6 +6555,7 @@
           <w:cantSplit/>
           <w:cantSplit/>
           <w:cantSplit/>
+          <w:cantSplit/>
         </w:trPr>
         <w:tc>
           <w:tcPr>
@@ -6563,15 +6630,17 @@
               <w:spacing w:after="0" w:before="0" w:line="240" w:lineRule="auto"/>
               <w:jc w:val="left"/>
             </w:pPr>
-            <w:r>
-              <w:rPr>
-                <w:rFonts w:ascii="Aptos" w:hAnsi="Aptos"/>
-                <w:b w:val="0"/>
-                <w:color w:val="243024"/>
-                <w:sz w:val="19"/>
-              </w:rPr>
-              <w:t>Maintain, test and improve</w:t>
-            </w:r>
+            <w:hyperlink r:id="rId48">
+              <w:r>
+                <w:rPr>
+                  <w:color w:val="2B6B3F"/>
+                  <w:u w:val="single"/>
+                  <w:rFonts w:ascii="Aptos" w:hAnsi="Aptos"/>
+                  <w:sz w:val="19"/>
+                </w:rPr>
+                <w:t>Maintain, test and improve</w:t>
+              </w:r>
+            </w:hyperlink>
           </w:p>
         </w:tc>
         <w:tc>
@@ -6666,6 +6735,7 @@
           <w:cantSplit/>
           <w:cantSplit/>
           <w:cantSplit/>
+          <w:cantSplit/>
         </w:trPr>
         <w:tc>
           <w:tcPr>
@@ -6740,15 +6810,17 @@
               <w:spacing w:after="0" w:before="0" w:line="240" w:lineRule="auto"/>
               <w:jc w:val="left"/>
             </w:pPr>
-            <w:r>
-              <w:rPr>
-                <w:rFonts w:ascii="Aptos" w:hAnsi="Aptos"/>
-                <w:b w:val="0"/>
-                <w:color w:val="243024"/>
-                <w:sz w:val="19"/>
-              </w:rPr>
-              <w:t>Community food and waste</w:t>
-            </w:r>
+            <w:hyperlink r:id="rId48">
+              <w:r>
+                <w:rPr>
+                  <w:color w:val="2B6B3F"/>
+                  <w:u w:val="single"/>
+                  <w:rFonts w:ascii="Aptos" w:hAnsi="Aptos"/>
+                  <w:sz w:val="19"/>
+                </w:rPr>
+                <w:t>Community food and waste</w:t>
+              </w:r>
+            </w:hyperlink>
           </w:p>
         </w:tc>
         <w:tc>
@@ -6843,6 +6915,7 @@
           <w:cantSplit/>
           <w:cantSplit/>
           <w:cantSplit/>
+          <w:cantSplit/>
         </w:trPr>
         <w:tc>
           <w:tcPr>
@@ -6917,15 +6990,17 @@
               <w:spacing w:after="0" w:before="0" w:line="240" w:lineRule="auto"/>
               <w:jc w:val="left"/>
             </w:pPr>
-            <w:r>
-              <w:rPr>
-                <w:rFonts w:ascii="Aptos" w:hAnsi="Aptos"/>
-                <w:b w:val="0"/>
-                <w:color w:val="243024"/>
-                <w:sz w:val="19"/>
-              </w:rPr>
-              <w:t>Harvest, measure and trace quality</w:t>
-            </w:r>
+            <w:hyperlink r:id="rId49">
+              <w:r>
+                <w:rPr>
+                  <w:color w:val="2B6B3F"/>
+                  <w:u w:val="single"/>
+                  <w:rFonts w:ascii="Aptos" w:hAnsi="Aptos"/>
+                  <w:sz w:val="19"/>
+                </w:rPr>
+                <w:t>Harvest, measure and trace quality</w:t>
+              </w:r>
+            </w:hyperlink>
           </w:p>
         </w:tc>
         <w:tc>
@@ -7020,6 +7095,7 @@
           <w:cantSplit/>
           <w:cantSplit/>
           <w:cantSplit/>
+          <w:cantSplit/>
         </w:trPr>
         <w:tc>
           <w:tcPr>
@@ -7094,15 +7170,17 @@
               <w:spacing w:after="0" w:before="0" w:line="240" w:lineRule="auto"/>
               <w:jc w:val="left"/>
             </w:pPr>
-            <w:r>
-              <w:rPr>
-                <w:rFonts w:ascii="Aptos" w:hAnsi="Aptos"/>
-                <w:b w:val="0"/>
-                <w:color w:val="243024"/>
-                <w:sz w:val="19"/>
-              </w:rPr>
-              <w:t>Judge quality and pitch version 2</w:t>
-            </w:r>
+            <w:hyperlink r:id="rId49">
+              <w:r>
+                <w:rPr>
+                  <w:color w:val="2B6B3F"/>
+                  <w:u w:val="single"/>
+                  <w:rFonts w:ascii="Aptos" w:hAnsi="Aptos"/>
+                  <w:sz w:val="19"/>
+                </w:rPr>
+                <w:t>Judge quality and pitch version 2</w:t>
+              </w:r>
+            </w:hyperlink>
           </w:p>
         </w:tc>
         <w:tc>

</xml_diff>